<commit_message>
Feed und Downloads aus dem bereinigten Archiv neu erzeugen
Der RSS-Feed trug beide Kennungen: pmid-42731841 und pmid- 42731841. An der
Kennung erkennt Mailchimps RSS-Versand, was schon hinausging - diese drei
Studien waeren ein zweites Mal verschickt worden.

Der naechste Tageslauf haette den Feed ohnehin neu geschrieben. Bis dahin
haette aber eine RSS-Kampagne feuern koennen, und dann waere es zu spaet
gewesen.

Die Tagesliste steht jetzt auf 3 statt 6 Studien: Drei der sechs vom 15.09.
waren die Dubletten vom 14.09.

Co-Authored-By: Claude Opus 5 <noreply@anthropic.com>
</commit_message>
<xml_diff>
--- a/download/studien-aktuell.docx
+++ b/download/studien-aktuell.docx
@@ -62,7 +62,7 @@
           <w:color w:val="666666"/>
           <w:sz w:val="18"/>
         </w:rPr>
-        <w:t>Stand: 15.09.2026  |  6 Studien  |  ki.m-vf.de</w:t>
+        <w:t>Stand: 15.09.2026  |  3 Studien  |  ki.m-vf.de</w:t>
       </w:r>
     </w:p>
     <w:p>
@@ -194,64 +194,6 @@
         <w:pStyle w:val="Heading2"/>
       </w:pPr>
       <w:r>
-        <w:t>Verhaltensgesteuerte SMS-Erinnerungen zur Cervixkrebsvorsorge bei schweren psychischen Erkrankungen: Pilot-RCT</w:t>
-      </w:r>
-    </w:p>
-    <w:p>
-      <w:r>
-        <w:rPr>
-          <w:i/>
-          <w:color w:val="666666"/>
-          <w:sz w:val="18"/>
-        </w:rPr>
-        <w:t>Nichol B et al.  ·  BMJ Open  ·  11.09.2026  ·  PMID 42731841</w:t>
-      </w:r>
-    </w:p>
-    <w:p>
-      <w:r>
-        <w:t>Machbarkeitsstudie mit randomisierter Zuweisung von 150 Patienten (75 pro Arm) zu verstärkter oder Standard-SMS-Erinnerung in 13 englischen Hausarztpraxen, Follow-up nach 18 Wochen.</w:t>
-      </w:r>
-    </w:p>
-    <w:p>
-      <w:r>
-        <w:rPr>
-          <w:b/>
-        </w:rPr>
-        <w:t xml:space="preserve">Ergebnis: </w:t>
-      </w:r>
-      <w:r>
-        <w:t>SMS-Lieferrate 88% (Intervention 85%, Kontrollgruppe 91%), 5 Patienten besuchten Screening in Studienperiode, Machbarkeitskriterien erfüllt (Praxis-Rekrutierung 27%, Retention 77-100%, Datenvollständigkeit 64%), aber Fragebogenrücklaufquote niedrig (7%).</w:t>
-      </w:r>
-    </w:p>
-    <w:p>
-      <w:r>
-        <w:rPr>
-          <w:b/>
-          <w:sz w:val="19"/>
-        </w:rPr>
-        <w:t xml:space="preserve">Übertragbarkeit: </w:t>
-      </w:r>
-      <w:r>
-        <w:rPr>
-          <w:sz w:val="19"/>
-        </w:rPr>
-        <w:t>England, psychische Gesundheit und Prävention im Nationalgesundheitssystem.</w:t>
-      </w:r>
-    </w:p>
-    <w:p>
-      <w:r>
-        <w:rPr>
-          <w:color w:val="5A7D3A"/>
-          <w:sz w:val="18"/>
-        </w:rPr>
-        <w:t>https://pubmed.ncbi.nlm.nih.gov/42731841/</w:t>
-      </w:r>
-    </w:p>
-    <w:p>
-      <w:pPr>
-        <w:pStyle w:val="Heading2"/>
-      </w:pPr>
-      <w:r>
         <w:t>Deep Learning für automatische Axon-Segmentierung in Bielschowsky-Silberfärbung</w:t>
       </w:r>
     </w:p>
@@ -303,122 +245,6 @@
           <w:sz w:val="18"/>
         </w:rPr>
         <w:t>https://pubmed.ncbi.nlm.nih.gov/42709277/</w:t>
-      </w:r>
-    </w:p>
-    <w:p>
-      <w:pPr>
-        <w:pStyle w:val="Heading2"/>
-      </w:pPr>
-      <w:r>
-        <w:t>Smartphone-App zur objektiven Quantifizierung von Bindehaut-Hyperämie mittels Gefäßdichte</w:t>
-      </w:r>
-    </w:p>
-    <w:p>
-      <w:r>
-        <w:rPr>
-          <w:i/>
-          <w:color w:val="666666"/>
-          <w:sz w:val="18"/>
-        </w:rPr>
-        <w:t>Rubegni G et al.  ·  Transl Vis Sci Technol  ·  01.09.2026  ·  PMID 42708554</w:t>
-      </w:r>
-    </w:p>
-    <w:p>
-      <w:r>
-        <w:t>Entwicklung einer mobilen Anwendung (Conjunctiva VD) für automatische Gefäßdichte-Messung auf 100 Bilder aus öffentlichen Datensätzen, validiert gegen drei Experten-Bewertungen.</w:t>
-      </w:r>
-    </w:p>
-    <w:p>
-      <w:r>
-        <w:rPr>
-          <w:b/>
-        </w:rPr>
-        <w:t xml:space="preserve">Ergebnis: </w:t>
-      </w:r>
-      <w:r>
-        <w:t>Inter-Rater-Reliabilität Efron-Grading κ 0,854-0,885, App-VD korrelierte stark mit Efron-Graden (Spearman ρ 0,780-0,807, alle p&lt;0,001) und Experten-VD-Schätzung (ρ 0,814-0,843, alle p&lt;0,001).</w:t>
-      </w:r>
-    </w:p>
-    <w:p>
-      <w:r>
-        <w:rPr>
-          <w:b/>
-          <w:sz w:val="19"/>
-        </w:rPr>
-        <w:t xml:space="preserve">Übertragbarkeit: </w:t>
-      </w:r>
-      <w:r>
-        <w:rPr>
-          <w:sz w:val="19"/>
-        </w:rPr>
-        <w:t>Italien, Teleophthalmologie, Mobil-Healthcare im ambulanten Screening.</w:t>
-      </w:r>
-    </w:p>
-    <w:p>
-      <w:r>
-        <w:rPr>
-          <w:color w:val="5A7D3A"/>
-          <w:sz w:val="18"/>
-        </w:rPr>
-        <w:t>https://pubmed.ncbi.nlm.nih.gov/42708554/</w:t>
-      </w:r>
-    </w:p>
-    <w:p>
-      <w:pPr>
-        <w:pStyle w:val="Heading2"/>
-      </w:pPr>
-      <w:r>
-        <w:t>Deep Learning für automatische Segment-Erkennung des Bizeps-Sehne in Arthroskopie-Bildern</w:t>
-      </w:r>
-    </w:p>
-    <w:p>
-      <w:r>
-        <w:rPr>
-          <w:i/>
-          <w:color w:val="666666"/>
-          <w:sz w:val="18"/>
-        </w:rPr>
-        <w:t>Schumann N et al.  ·  Sci Prog  ·  07.09.2026  ·  PMID 42704781</w:t>
-      </w:r>
-    </w:p>
-    <w:p>
-      <w:r>
-        <w:t>Retrospektive Kohortenstudie mit 200 manuell annotiert Arthroskopie-Bildern von 124 Patienten zur Evaluierung von MASKRCNN_RESNET50_FPN für objektive Segmentierung des langen Bizepskopfs.</w:t>
-      </w:r>
-    </w:p>
-    <w:p>
-      <w:r>
-        <w:rPr>
-          <w:b/>
-        </w:rPr>
-        <w:t xml:space="preserve">Ergebnis: </w:t>
-      </w:r>
-      <w:r>
-        <w:t>Expert-Evaluation: Precision 0,88; automatische Pixel-Ebene: mittlere Precision 0,83, Recall 0,86, F1-Score 0,83, IoU 0,76; Modell zeigte konsistente Performance über Sehnenarenierungen; U-Net erzielte höheres IoU 0,91 (p&lt;0,001).</w:t>
-      </w:r>
-    </w:p>
-    <w:p>
-      <w:r>
-        <w:rPr>
-          <w:b/>
-          <w:sz w:val="19"/>
-        </w:rPr>
-        <w:t xml:space="preserve">Übertragbarkeit: </w:t>
-      </w:r>
-      <w:r>
-        <w:rPr>
-          <w:sz w:val="19"/>
-        </w:rPr>
-        <w:t>Deutschland (Bochum), operativer Arbeitsplatz, intraoperative Entscheidungsunterstützung.</w:t>
-      </w:r>
-    </w:p>
-    <w:p>
-      <w:r>
-        <w:rPr>
-          <w:color w:val="5A7D3A"/>
-          <w:sz w:val="18"/>
-        </w:rPr>
-        <w:t>https://pubmed.ncbi.nlm.nih.gov/42704781/</w:t>
       </w:r>
     </w:p>
     <w:sectPr>

</xml_diff>